<commit_message>
Lazy-load routes/pages and add PDF asset
Convert several route and page imports in App.tsx to React.lazy to enable code-splitting and improve load performance (PublicRoutes, PortalRoutes, OpsRoutes, AdminRoutes, MoonshotRoutes, Auth, ResetPassword, NotFound, Store, StoreProductPage, Unsubscribe, CheckoutPage, CartPage). Also add a PDF version of Vizionize_AI_Barbados_Retail_Pricing_Editable.pdf and update the existing .docx asset.
</commit_message>
<xml_diff>
--- a/src/assets/Vizionize_AI_Barbados_Retail_Pricing_Editable.docx
+++ b/src/assets/Vizionize_AI_Barbados_Retail_Pricing_Editable.docx
@@ -212,6 +212,21 @@
               <w:spacing w:after="0"/>
             </w:pPr>
           </w:p>
+          <w:p>
+            <w:pPr>
+              <w:spacing w:after="0"/>
+            </w:pPr>
+          </w:p>
+          <w:p>
+            <w:pPr>
+              <w:spacing w:after="0"/>
+            </w:pPr>
+          </w:p>
+          <w:p>
+            <w:pPr>
+              <w:spacing w:after="0"/>
+            </w:pPr>
+          </w:p>
           <w:tbl>
             <w:tblPr>
               <w:tblW w:w="0" w:type="auto"/>
@@ -270,7 +285,25 @@
                       <w:color w:val="FFFFFF"/>
                       <w:sz w:val="42"/>
                     </w:rPr>
-                    <w:t>LENS CARE</w:t>
+                    <w:t xml:space="preserve">LENS </w:t>
+                  </w:r>
+                  <w:r>
+                    <w:rPr>
+                      <w:rFonts w:ascii="Arial Narrow" w:eastAsia="Arial Narrow" w:hAnsi="Arial Narrow"/>
+                      <w:b/>
+                      <w:color w:val="FFFFFF"/>
+                      <w:sz w:val="42"/>
+                    </w:rPr>
+                    <w:t xml:space="preserve">and SCREEN </w:t>
+                  </w:r>
+                  <w:r>
+                    <w:rPr>
+                      <w:rFonts w:ascii="Arial Narrow" w:eastAsia="Arial Narrow" w:hAnsi="Arial Narrow"/>
+                      <w:b/>
+                      <w:color w:val="FFFFFF"/>
+                      <w:sz w:val="42"/>
+                    </w:rPr>
+                    <w:t>CARE</w:t>
                   </w:r>
                 </w:p>
                 <w:p>
@@ -639,6 +672,66 @@
             </w:tcMar>
             <w:vAlign w:val="center"/>
           </w:tcPr>
+          <w:p>
+            <w:pPr>
+              <w:spacing w:after="0"/>
+              <w:jc w:val="center"/>
+              <w:rPr>
+                <w:rFonts w:ascii="Arial Narrow" w:eastAsia="Arial Narrow" w:hAnsi="Arial Narrow"/>
+                <w:b/>
+                <w:color w:val="00E7E0"/>
+                <w:sz w:val="32"/>
+              </w:rPr>
+            </w:pPr>
+          </w:p>
+          <w:p>
+            <w:pPr>
+              <w:spacing w:after="0"/>
+              <w:jc w:val="center"/>
+              <w:rPr>
+                <w:rFonts w:ascii="Arial Narrow" w:eastAsia="Arial Narrow" w:hAnsi="Arial Narrow"/>
+                <w:b/>
+                <w:color w:val="00E7E0"/>
+                <w:sz w:val="32"/>
+              </w:rPr>
+            </w:pPr>
+          </w:p>
+          <w:p>
+            <w:pPr>
+              <w:spacing w:after="0"/>
+              <w:jc w:val="center"/>
+              <w:rPr>
+                <w:rFonts w:ascii="Arial Narrow" w:eastAsia="Arial Narrow" w:hAnsi="Arial Narrow"/>
+                <w:b/>
+                <w:color w:val="00E7E0"/>
+                <w:sz w:val="32"/>
+              </w:rPr>
+            </w:pPr>
+          </w:p>
+          <w:p>
+            <w:pPr>
+              <w:spacing w:after="0"/>
+              <w:jc w:val="center"/>
+              <w:rPr>
+                <w:rFonts w:ascii="Arial Narrow" w:eastAsia="Arial Narrow" w:hAnsi="Arial Narrow"/>
+                <w:b/>
+                <w:color w:val="00E7E0"/>
+                <w:sz w:val="32"/>
+              </w:rPr>
+            </w:pPr>
+          </w:p>
+          <w:p>
+            <w:pPr>
+              <w:spacing w:after="0"/>
+              <w:jc w:val="center"/>
+              <w:rPr>
+                <w:rFonts w:ascii="Arial Narrow" w:eastAsia="Arial Narrow" w:hAnsi="Arial Narrow"/>
+                <w:b/>
+                <w:color w:val="00E7E0"/>
+                <w:sz w:val="32"/>
+              </w:rPr>
+            </w:pPr>
+          </w:p>
           <w:p>
             <w:pPr>
               <w:spacing w:after="0"/>
@@ -1709,6 +1802,35 @@
                 <w:p>
                   <w:pPr>
                     <w:spacing w:after="0"/>
+                    <w:rPr>
+                      <w:rFonts w:ascii="Arial Narrow" w:eastAsia="Arial Narrow" w:hAnsi="Arial Narrow"/>
+                      <w:b/>
+                      <w:color w:val="FFFFFF"/>
+                      <w:szCs w:val="12"/>
+                    </w:rPr>
+                  </w:pPr>
+                  <w:r>
+                    <w:rPr>
+                      <w:rFonts w:ascii="Arial Narrow" w:eastAsia="Arial Narrow" w:hAnsi="Arial Narrow"/>
+                      <w:b/>
+                      <w:color w:val="FFFFFF"/>
+                      <w:szCs w:val="12"/>
+                    </w:rPr>
+                    <w:t>D</w:t>
+                  </w:r>
+                  <w:r>
+                    <w:rPr>
+                      <w:rFonts w:ascii="Arial Narrow" w:eastAsia="Arial Narrow" w:hAnsi="Arial Narrow"/>
+                      <w:b/>
+                      <w:color w:val="FFFFFF"/>
+                      <w:szCs w:val="12"/>
+                    </w:rPr>
+                    <w:t>istributed by:</w:t>
+                  </w:r>
+                </w:p>
+                <w:p>
+                  <w:pPr>
+                    <w:spacing w:after="0"/>
                   </w:pPr>
                   <w:r>
                     <w:rPr>
@@ -1729,65 +1851,59 @@
                       <w:color w:val="A9B8CA"/>
                       <w:sz w:val="16"/>
                     </w:rPr>
-                    <w:t>Your optical supply partner in Barbados</w:t>
+                    <w:t>Your optical supply partner</w:t>
+                  </w:r>
+                  <w:r>
+                    <w:rPr>
+                      <w:color w:val="A9B8CA"/>
+                      <w:sz w:val="16"/>
+                    </w:rPr>
+                    <w:t>.</w:t>
                   </w:r>
                 </w:p>
                 <w:p>
                   <w:pPr>
                     <w:spacing w:after="0"/>
-                    <w:rPr>
-                      <w:lang w:val="fr-CA"/>
-                    </w:rPr>
                   </w:pPr>
                   <w:r>
                     <w:rPr>
                       <w:color w:val="00E7E0"/>
                       <w:sz w:val="16"/>
-                      <w:lang w:val="fr-CA"/>
                     </w:rPr>
-                    <w:t>Web: classicvisions.net</w:t>
+                    <w:t xml:space="preserve">Web: </w:t>
+                  </w:r>
+                  <w:r>
+                    <w:rPr>
+                      <w:color w:val="00E7E0"/>
+                      <w:sz w:val="16"/>
+                    </w:rPr>
+                    <w:t>www.</w:t>
+                  </w:r>
+                  <w:r>
+                    <w:rPr>
+                      <w:color w:val="00E7E0"/>
+                      <w:sz w:val="16"/>
+                    </w:rPr>
+                    <w:t>classicvisions.net</w:t>
                   </w:r>
                 </w:p>
                 <w:p>
                   <w:pPr>
                     <w:spacing w:after="0"/>
-                    <w:rPr>
-                      <w:lang w:val="fr-CA"/>
-                    </w:rPr>
                   </w:pPr>
-                  <w:proofErr w:type="gramStart"/>
                   <w:r>
                     <w:rPr>
                       <w:color w:val="00E7E0"/>
                       <w:sz w:val="16"/>
-                      <w:lang w:val="fr-CA"/>
                     </w:rPr>
-                    <w:t>Email</w:t>
-                  </w:r>
-                  <w:proofErr w:type="gramEnd"/>
-                  <w:r>
-                    <w:rPr>
-                      <w:color w:val="00E7E0"/>
-                      <w:sz w:val="16"/>
-                      <w:lang w:val="fr-CA"/>
-                    </w:rPr>
-                    <w:t xml:space="preserve">: </w:t>
+                    <w:t xml:space="preserve">Email: </w:t>
                   </w:r>
                   <w:r>
                     <w:rPr>
                       <w:color w:val="00E7E0"/>
                       <w:sz w:val="16"/>
-                      <w:lang w:val="fr-CA"/>
                     </w:rPr>
-                    <w:t>r</w:t>
-                  </w:r>
-                  <w:r>
-                    <w:rPr>
-                      <w:color w:val="00E7E0"/>
-                      <w:sz w:val="16"/>
-                      <w:lang w:val="fr-CA"/>
-                    </w:rPr>
-                    <w:t>ussell@classicvisions.net</w:t>
+                    <w:t>russell@classicvisions.net</w:t>
                   </w:r>
                 </w:p>
               </w:tc>
@@ -1918,7 +2034,7 @@
       </w:tr>
       <w:tr>
         <w:trPr>
-          <w:trHeight w:hRule="exact" w:val="4680"/>
+          <w:trHeight w:hRule="exact" w:val="60"/>
           <w:jc w:val="center"/>
         </w:trPr>
         <w:tc>

</xml_diff>

<commit_message>
Add USD retail pricing and update Barbados docx
Replace Vizionize_AI_Barbados_Retail_Pricing_Editable.docx with an updated version and add USD retail pricing assets to src/assets. New files: Vizionize_AI_USD_Retail_Pricing.docx and Vizionize_AI_USD_Retail_Pricing.pdf.
</commit_message>
<xml_diff>
--- a/src/assets/Vizionize_AI_Barbados_Retail_Pricing_Editable.docx
+++ b/src/assets/Vizionize_AI_Barbados_Retail_Pricing_Editable.docx
@@ -154,7 +154,16 @@
                       <w:color w:val="00E7E0"/>
                       <w:sz w:val="22"/>
                     </w:rPr>
-                    <w:t>THE FUTURE IS NOW</w:t>
+                    <w:t xml:space="preserve">THE FUTURE IS </w:t>
+                  </w:r>
+                  <w:proofErr w:type="gramStart"/>
+                  <w:r>
+                    <w:rPr>
+                      <w:b/>
+                      <w:color w:val="00E7E0"/>
+                      <w:sz w:val="22"/>
+                    </w:rPr>
+                    <w:t>NOW</w:t>
                   </w:r>
                   <w:r>
                     <w:rPr>
@@ -162,7 +171,16 @@
                       <w:color w:val="F2A900"/>
                       <w:sz w:val="22"/>
                     </w:rPr>
-                    <w:t xml:space="preserve">  ·  </w:t>
+                    <w:t xml:space="preserve">  ·</w:t>
+                  </w:r>
+                  <w:proofErr w:type="gramEnd"/>
+                  <w:r>
+                    <w:rPr>
+                      <w:b/>
+                      <w:color w:val="F2A900"/>
+                      <w:sz w:val="22"/>
+                    </w:rPr>
+                    <w:t xml:space="preserve">  </w:t>
                   </w:r>
                   <w:r>
                     <w:rPr>
@@ -433,6 +451,10 @@
                       <w:p>
                         <w:pPr>
                           <w:spacing w:after="0"/>
+                          <w:rPr>
+                            <w:color w:val="EAF4FF"/>
+                            <w:sz w:val="16"/>
+                          </w:rPr>
                         </w:pPr>
                         <w:r>
                           <w:rPr>
@@ -449,6 +471,129 @@
                           </w:rPr>
                           <w:t>Premium eyewear</w:t>
                         </w:r>
+                        <w:r>
+                          <w:rPr>
+                            <w:color w:val="EAF4FF"/>
+                            <w:sz w:val="16"/>
+                          </w:rPr>
+                          <w:br/>
+                        </w:r>
+                        <w:r>
+                          <w:rPr>
+                            <w:b/>
+                            <w:color w:val="00E7E0"/>
+                            <w:sz w:val="16"/>
+                          </w:rPr>
+                          <w:t xml:space="preserve">◇ </w:t>
+                        </w:r>
+                        <w:r>
+                          <w:rPr>
+                            <w:color w:val="EAF4FF"/>
+                            <w:sz w:val="16"/>
+                          </w:rPr>
+                          <w:t>Face Shields</w:t>
+                        </w:r>
+                      </w:p>
+                      <w:p>
+                        <w:pPr>
+                          <w:spacing w:after="0"/>
+                          <w:rPr>
+                            <w:color w:val="EAF4FF"/>
+                            <w:sz w:val="16"/>
+                          </w:rPr>
+                        </w:pPr>
+                        <w:r>
+                          <w:rPr>
+                            <w:b/>
+                            <w:color w:val="00E7E0"/>
+                            <w:sz w:val="16"/>
+                          </w:rPr>
+                          <w:t xml:space="preserve">◇ </w:t>
+                        </w:r>
+                        <w:r>
+                          <w:rPr>
+                            <w:color w:val="EAF4FF"/>
+                            <w:sz w:val="16"/>
+                          </w:rPr>
+                          <w:t>D</w:t>
+                        </w:r>
+                        <w:r>
+                          <w:rPr>
+                            <w:color w:val="EAF4FF"/>
+                            <w:sz w:val="16"/>
+                          </w:rPr>
+                          <w:t>elicate optical surfaces</w:t>
+                        </w:r>
+                      </w:p>
+                      <w:p>
+                        <w:pPr>
+                          <w:spacing w:after="0"/>
+                          <w:rPr>
+                            <w:color w:val="EAF4FF"/>
+                            <w:sz w:val="16"/>
+                          </w:rPr>
+                        </w:pPr>
+                        <w:r>
+                          <w:rPr>
+                            <w:b/>
+                            <w:color w:val="00E7E0"/>
+                            <w:sz w:val="16"/>
+                          </w:rPr>
+                          <w:t xml:space="preserve">◇ </w:t>
+                        </w:r>
+                        <w:r>
+                          <w:rPr>
+                            <w:color w:val="EAF4FF"/>
+                            <w:sz w:val="16"/>
+                          </w:rPr>
+                          <w:t>S</w:t>
+                        </w:r>
+                        <w:r>
+                          <w:rPr>
+                            <w:color w:val="EAF4FF"/>
+                            <w:sz w:val="16"/>
+                          </w:rPr>
+                          <w:t>martphones</w:t>
+                        </w:r>
+                        <w:r>
+                          <w:rPr>
+                            <w:color w:val="EAF4FF"/>
+                            <w:sz w:val="16"/>
+                          </w:rPr>
+                          <w:t>, Tablets</w:t>
+                        </w:r>
+                      </w:p>
+                      <w:p>
+                        <w:pPr>
+                          <w:spacing w:after="0"/>
+                          <w:rPr>
+                            <w:color w:val="EAF4FF"/>
+                            <w:sz w:val="16"/>
+                          </w:rPr>
+                        </w:pPr>
+                      </w:p>
+                      <w:p>
+                        <w:pPr>
+                          <w:spacing w:after="0"/>
+                          <w:rPr>
+                            <w:color w:val="EAF4FF"/>
+                            <w:sz w:val="16"/>
+                          </w:rPr>
+                        </w:pPr>
+                      </w:p>
+                      <w:p>
+                        <w:pPr>
+                          <w:spacing w:after="0"/>
+                          <w:rPr>
+                            <w:color w:val="EAF4FF"/>
+                            <w:sz w:val="16"/>
+                          </w:rPr>
+                        </w:pPr>
+                      </w:p>
+                      <w:p>
+                        <w:pPr>
+                          <w:spacing w:after="0"/>
+                        </w:pPr>
                       </w:p>
                     </w:tc>
                     <w:tc>
@@ -537,6 +682,10 @@
                       <w:p>
                         <w:pPr>
                           <w:spacing w:after="0"/>
+                          <w:rPr>
+                            <w:color w:val="EAF4FF"/>
+                            <w:sz w:val="16"/>
+                          </w:rPr>
                         </w:pPr>
                         <w:r>
                           <w:rPr>
@@ -553,6 +702,129 @@
                           </w:rPr>
                           <w:t>Smudges &amp; film</w:t>
                         </w:r>
+                        <w:r>
+                          <w:rPr>
+                            <w:color w:val="EAF4FF"/>
+                            <w:sz w:val="16"/>
+                          </w:rPr>
+                          <w:br/>
+                        </w:r>
+                        <w:r>
+                          <w:rPr>
+                            <w:b/>
+                            <w:color w:val="00E7E0"/>
+                            <w:sz w:val="16"/>
+                          </w:rPr>
+                          <w:t xml:space="preserve">◇ </w:t>
+                        </w:r>
+                        <w:r>
+                          <w:rPr>
+                            <w:color w:val="EAF4FF"/>
+                            <w:sz w:val="16"/>
+                          </w:rPr>
+                          <w:t>R</w:t>
+                        </w:r>
+                        <w:r>
+                          <w:rPr>
+                            <w:color w:val="EAF4FF"/>
+                            <w:sz w:val="16"/>
+                          </w:rPr>
+                          <w:t xml:space="preserve">educed </w:t>
+                        </w:r>
+                        <w:proofErr w:type="gramStart"/>
+                        <w:r>
+                          <w:rPr>
+                            <w:color w:val="EAF4FF"/>
+                            <w:sz w:val="16"/>
+                          </w:rPr>
+                          <w:t>streaking</w:t>
+                        </w:r>
+                        <w:proofErr w:type="gramEnd"/>
+                        <w:r>
+                          <w:rPr>
+                            <w:color w:val="EAF4FF"/>
+                            <w:sz w:val="16"/>
+                          </w:rPr>
+                          <w:t xml:space="preserve"> </w:t>
+                        </w:r>
+                        <w:proofErr w:type="gramStart"/>
+                        <w:r>
+                          <w:rPr>
+                            <w:color w:val="EAF4FF"/>
+                            <w:sz w:val="16"/>
+                          </w:rPr>
+                          <w:t>and</w:t>
+                        </w:r>
+                        <w:proofErr w:type="gramEnd"/>
+                        <w:r>
+                          <w:rPr>
+                            <w:color w:val="EAF4FF"/>
+                            <w:sz w:val="16"/>
+                          </w:rPr>
+                          <w:t xml:space="preserve"> </w:t>
+                        </w:r>
+                        <w:proofErr w:type="gramStart"/>
+                        <w:r>
+                          <w:rPr>
+                            <w:color w:val="EAF4FF"/>
+                            <w:sz w:val="16"/>
+                          </w:rPr>
+                          <w:t>residue</w:t>
+                        </w:r>
+                        <w:proofErr w:type="gramEnd"/>
+                      </w:p>
+                      <w:p>
+                        <w:pPr>
+                          <w:spacing w:after="0"/>
+                          <w:rPr>
+                            <w:color w:val="EAF4FF"/>
+                            <w:sz w:val="16"/>
+                          </w:rPr>
+                        </w:pPr>
+                        <w:r>
+                          <w:rPr>
+                            <w:b/>
+                            <w:color w:val="00E7E0"/>
+                            <w:sz w:val="16"/>
+                          </w:rPr>
+                          <w:t xml:space="preserve">◇ </w:t>
+                        </w:r>
+                        <w:r>
+                          <w:rPr>
+                            <w:color w:val="EAF4FF"/>
+                            <w:sz w:val="16"/>
+                          </w:rPr>
+                          <w:t>Premium eyewear</w:t>
+                        </w:r>
+                      </w:p>
+                      <w:p>
+                        <w:pPr>
+                          <w:spacing w:after="0"/>
+                          <w:rPr>
+                            <w:color w:val="EAF4FF"/>
+                            <w:sz w:val="16"/>
+                          </w:rPr>
+                        </w:pPr>
+                        <w:r>
+                          <w:rPr>
+                            <w:b/>
+                            <w:color w:val="00E7E0"/>
+                            <w:sz w:val="16"/>
+                          </w:rPr>
+                          <w:t xml:space="preserve">◇ </w:t>
+                        </w:r>
+                        <w:r>
+                          <w:rPr>
+                            <w:color w:val="EAF4FF"/>
+                            <w:sz w:val="16"/>
+                          </w:rPr>
+                          <w:t>Premium eyewear</w:t>
+                        </w:r>
+                      </w:p>
+                      <w:p>
+                        <w:pPr>
+                          <w:spacing w:after="0"/>
+                        </w:pPr>
                       </w:p>
                     </w:tc>
                   </w:tr>
@@ -567,7 +839,55 @@
                       <w:color w:val="A9B8CA"/>
                       <w:sz w:val="15"/>
                     </w:rPr>
-                    <w:t>Scratch-resistant  ·  AR safe  ·  AI-driven formula  ·  Streak-free finish</w:t>
+                    <w:t>Scratch-</w:t>
+                  </w:r>
+                  <w:proofErr w:type="gramStart"/>
+                  <w:r>
+                    <w:rPr>
+                      <w:color w:val="A9B8CA"/>
+                      <w:sz w:val="15"/>
+                    </w:rPr>
+                    <w:t>resistant  ·</w:t>
+                  </w:r>
+                  <w:proofErr w:type="gramEnd"/>
+                  <w:r>
+                    <w:rPr>
+                      <w:color w:val="A9B8CA"/>
+                      <w:sz w:val="15"/>
+                    </w:rPr>
+                    <w:t xml:space="preserve">  AR </w:t>
+                  </w:r>
+                  <w:proofErr w:type="gramStart"/>
+                  <w:r>
+                    <w:rPr>
+                      <w:color w:val="A9B8CA"/>
+                      <w:sz w:val="15"/>
+                    </w:rPr>
+                    <w:t>safe  ·</w:t>
+                  </w:r>
+                  <w:proofErr w:type="gramEnd"/>
+                  <w:r>
+                    <w:rPr>
+                      <w:color w:val="A9B8CA"/>
+                      <w:sz w:val="15"/>
+                    </w:rPr>
+                    <w:t xml:space="preserve">  AI-driven </w:t>
+                  </w:r>
+                  <w:proofErr w:type="gramStart"/>
+                  <w:r>
+                    <w:rPr>
+                      <w:color w:val="A9B8CA"/>
+                      <w:sz w:val="15"/>
+                    </w:rPr>
+                    <w:t>formula  ·</w:t>
+                  </w:r>
+                  <w:proofErr w:type="gramEnd"/>
+                  <w:r>
+                    <w:rPr>
+                      <w:color w:val="A9B8CA"/>
+                      <w:sz w:val="15"/>
+                    </w:rPr>
+                    <w:t xml:space="preserve">  Streak-free finish</w:t>
                   </w:r>
                 </w:p>
               </w:tc>
@@ -639,6 +959,12 @@
                   <w:pPr>
                     <w:spacing w:after="0"/>
                     <w:jc w:val="center"/>
+                    <w:rPr>
+                      <w:rFonts w:ascii="Arial Narrow" w:eastAsia="Arial Narrow" w:hAnsi="Arial Narrow"/>
+                      <w:b/>
+                      <w:color w:val="00E7E0"/>
+                      <w:sz w:val="31"/>
+                    </w:rPr>
                   </w:pPr>
                   <w:r>
                     <w:rPr>
@@ -648,6 +974,39 @@
                       <w:sz w:val="31"/>
                     </w:rPr>
                     <w:t>DEFEND YOUR LENS™</w:t>
+                  </w:r>
+                </w:p>
+                <w:p>
+                  <w:pPr>
+                    <w:spacing w:after="0"/>
+                    <w:jc w:val="center"/>
+                  </w:pPr>
+                  <w:r>
+                    <w:rPr>
+                      <w:rFonts w:ascii="Arial Narrow" w:eastAsia="Arial Narrow" w:hAnsi="Arial Narrow"/>
+                      <w:b/>
+                      <w:color w:val="00E7E0"/>
+                      <w:sz w:val="31"/>
+                    </w:rPr>
+                    <w:t>…a</w:t>
+                  </w:r>
+                  <w:r>
+                    <w:rPr>
+                      <w:rFonts w:ascii="Arial Narrow" w:eastAsia="Arial Narrow" w:hAnsi="Arial Narrow"/>
+                      <w:b/>
+                      <w:color w:val="00E7E0"/>
+                      <w:sz w:val="31"/>
+                    </w:rPr>
+                    <w:t xml:space="preserve">nd many other surfaces </w:t>
+                  </w:r>
+                  <w:r>
+                    <w:rPr>
+                      <w:rFonts w:ascii="Arial Narrow" w:eastAsia="Arial Narrow" w:hAnsi="Arial Narrow"/>
+                      <w:b/>
+                      <w:color w:val="00E7E0"/>
+                      <w:sz w:val="31"/>
+                    </w:rPr>
+                    <w:t>needing clarity</w:t>
                   </w:r>
                 </w:p>
               </w:tc>
@@ -744,7 +1103,16 @@
                 <w:color w:val="00E7E0"/>
                 <w:sz w:val="32"/>
               </w:rPr>
-              <w:t>BARBADOS RETAIL PRICING</w:t>
+              <w:t>USD</w:t>
+            </w:r>
+            <w:r>
+              <w:rPr>
+                <w:rFonts w:ascii="Arial Narrow" w:eastAsia="Arial Narrow" w:hAnsi="Arial Narrow"/>
+                <w:b/>
+                <w:color w:val="00E7E0"/>
+                <w:sz w:val="32"/>
+              </w:rPr>
+              <w:t xml:space="preserve"> RETAIL PRICING</w:t>
             </w:r>
           </w:p>
           <w:p>
@@ -757,7 +1125,23 @@
                 <w:color w:val="F2A900"/>
                 <w:sz w:val="16"/>
               </w:rPr>
-              <w:t>All prices in BBD  ·  VAT inclusive</w:t>
+              <w:t xml:space="preserve">All prices in </w:t>
+            </w:r>
+            <w:proofErr w:type="gramStart"/>
+            <w:r>
+              <w:rPr>
+                <w:color w:val="F2A900"/>
+                <w:sz w:val="16"/>
+              </w:rPr>
+              <w:t>BBD  ·</w:t>
+            </w:r>
+            <w:proofErr w:type="gramEnd"/>
+            <w:r>
+              <w:rPr>
+                <w:color w:val="F2A900"/>
+                <w:sz w:val="16"/>
+              </w:rPr>
+              <w:t xml:space="preserve">  VAT inclusive</w:t>
             </w:r>
           </w:p>
         </w:tc>
@@ -1502,8 +1886,16 @@
                     <w:rPr>
                       <w:color w:val="FFFFFF"/>
                     </w:rPr>
-                    <w:t>2.5 Gal Cubitainer</w:t>
+                    <w:t xml:space="preserve">2.5 Gal </w:t>
                   </w:r>
+                  <w:proofErr w:type="spellStart"/>
+                  <w:r>
+                    <w:rPr>
+                      <w:color w:val="FFFFFF"/>
+                    </w:rPr>
+                    <w:t>Cubitainer</w:t>
+                  </w:r>
+                  <w:proofErr w:type="spellEnd"/>
                 </w:p>
               </w:tc>
               <w:tc>
@@ -2018,12 +2410,21 @@
                     <w:spacing w:after="0"/>
                     <w:jc w:val="center"/>
                   </w:pPr>
+                  <w:proofErr w:type="gramStart"/>
                   <w:r>
                     <w:rPr>
                       <w:color w:val="A9B8CA"/>
                       <w:sz w:val="13"/>
                     </w:rPr>
-                    <w:t>Scan to order online</w:t>
+                    <w:t>Scan to</w:t>
+                  </w:r>
+                  <w:proofErr w:type="gramEnd"/>
+                  <w:r>
+                    <w:rPr>
+                      <w:color w:val="A9B8CA"/>
+                      <w:sz w:val="13"/>
+                    </w:rPr>
+                    <w:t xml:space="preserve"> order online</w:t>
                   </w:r>
                 </w:p>
               </w:tc>
@@ -2878,7 +3279,6 @@
   <w:style w:type="character" w:default="1" w:styleId="DefaultParagraphFont">
     <w:name w:val="Default Paragraph Font"/>
     <w:uiPriority w:val="1"/>
-    <w:semiHidden/>
     <w:unhideWhenUsed/>
   </w:style>
   <w:style w:type="table" w:default="1" w:styleId="TableNormal">

</xml_diff>